<commit_message>
Reducir la lectura inicial y codificar los formatos Go2Rev
</commit_message>
<xml_diff>
--- a/producto/arquitectura/v0.2/Go2Rev_arquitectura_metodologica_v0.2.docx
+++ b/producto/arquitectura/v0.2/Go2Rev_arquitectura_metodologica_v0.2.docx
@@ -24,7 +24,7 @@
         <w:jc w:val="both"/>
       </w:pPr>
       <w:r>
-        <w:t>Base fundacional aceptada por Carlos Estrada</w:t>
+        <w:t>Base metodológica fundacional</w:t>
       </w:r>
     </w:p>
     <w:p>
@@ -40,7 +40,7 @@
         <w:jc w:val="both"/>
       </w:pPr>
       <w:r>
-        <w:t>La arquitectura conserva diecisiete nodos, contratos y correspondencia con los once pasos de origen. Su desarrollo sustantivo está integrado en el paquete fundacional 0.3. Las pruebas del método se sitúan después del cierre de construcción y requieren un ámbito autorizado; no se atribuye aquí aplicación previa.</w:t>
+        <w:t>La arquitectura conserva diecisiete nodos, contratos y correspondencia con los once pasos de origen. Su desarrollo sustantivo está integrado en el paquete fundacional 0.4. Las pruebas del método se sitúan después del cierre de construcción y requieren un ámbito autorizado; no se atribuye aquí aplicación previa.</w:t>
       </w:r>
     </w:p>
     <w:p>

</xml_diff>

<commit_message>
Añadir identidad y enrutado metodológico
</commit_message>
<xml_diff>
--- a/producto/arquitectura/v0.2/Go2Rev_arquitectura_metodologica_v0.2.docx
+++ b/producto/arquitectura/v0.2/Go2Rev_arquitectura_metodologica_v0.2.docx
@@ -40,7 +40,7 @@
         <w:jc w:val="both"/>
       </w:pPr>
       <w:r>
-        <w:t>La arquitectura conserva diecisiete nodos, contratos y correspondencia con los once pasos de origen. Su desarrollo sustantivo está integrado en el paquete fundacional 0.5. Las pruebas del método se sitúan después del cierre de construcción y requieren un ámbito autorizado; no se atribuye aquí aplicación previa.</w:t>
+        <w:t>La arquitectura conserva diecisiete nodos, contratos y correspondencia con los once pasos de origen. Su desarrollo sustantivo está integrado en el paquete fundacional 0.6. Las pruebas del método se sitúan después del cierre de construcción y requieren un ámbito autorizado; no se atribuye aquí aplicación previa.</w:t>
       </w:r>
     </w:p>
     <w:p>
@@ -48,7 +48,7 @@
         <w:jc w:val="both"/>
       </w:pPr>
       <w:r>
-        <w:t>Esta vista reúne los cuatro archivos operativos actuales de arquitectura, con integración editorial del 11 de septiembre de 2026. Las fuentes editables permanecen en producto/arquitectura/v0.2. La vista se regenera desde ellas y conserva el estado teórico del producto.</w:t>
+        <w:t>Esta vista reúne los cuatro archivos operativos actuales de arquitectura, con integración editorial del 17 de septiembre de 2026. Las fuentes editables permanecen en producto/arquitectura/v0.2. La vista se regenera desde ellas y conserva el estado teórico del producto.</w:t>
       </w:r>
     </w:p>
     <w:p>
@@ -142,7 +142,7 @@
         <w:jc w:val="both"/>
       </w:pPr>
       <w:r>
-        <w:t xml:space="preserve">La primera base es enteramente teórica y no ha habido clientes. Las instrucciones, plantillas, modelos y protocolos que desarrollan esta arquitectura se localizan en el </w:t>
+        <w:t xml:space="preserve">La primera base sigue sin validación sustantiva de uso. Un intento de arranque en un encargo real detectó una interferencia metodológica antes de ejecutar Go2Rev; sirve como evidencia del mecanismo de activación, no de los nodos. Las instrucciones, plantillas, modelos y protocolos que desarrollan esta arquitectura se localizan en el </w:t>
       </w:r>
       <w:hyperlink r:id="rId11">
         <w:r>

</xml_diff>